<commit_message>
ex3 done complete with bonuses
</commit_message>
<xml_diff>
--- a/submission ex3/readme.docx
+++ b/submission ex3/readme.docx
@@ -620,6 +620,2068 @@
     <w:p>
       <w:pPr>
         <w:pStyle w:val="1"/>
+        <w:spacing w:before="0" w:after="120"/>
+      </w:pPr>
+      <w:r>
+        <w:lastRenderedPageBreak/>
+        <w:t>Server API Reference</w:t>
+      </w:r>
+    </w:p>
+    <w:tbl>
+      <w:tblPr>
+        <w:tblpPr w:leftFromText="180" w:rightFromText="180" w:vertAnchor="text" w:horzAnchor="margin" w:tblpXSpec="center" w:tblpY="1018"/>
+        <w:tblW w:w="6270" w:type="pct"/>
+        <w:tblBorders>
+          <w:top w:val="single" w:sz="4" w:space="0" w:color="auto"/>
+          <w:left w:val="single" w:sz="4" w:space="0" w:color="auto"/>
+          <w:bottom w:val="single" w:sz="4" w:space="0" w:color="auto"/>
+          <w:right w:val="single" w:sz="4" w:space="0" w:color="auto"/>
+          <w:insideH w:val="single" w:sz="4" w:space="0" w:color="auto"/>
+          <w:insideV w:val="single" w:sz="4" w:space="0" w:color="auto"/>
+        </w:tblBorders>
+        <w:tblLayout w:type="fixed"/>
+        <w:tblLook w:val="0020" w:firstRow="1" w:lastRow="0" w:firstColumn="0" w:lastColumn="0" w:noHBand="0" w:noVBand="0"/>
+      </w:tblPr>
+      <w:tblGrid>
+        <w:gridCol w:w="967"/>
+        <w:gridCol w:w="2851"/>
+        <w:gridCol w:w="4544"/>
+        <w:gridCol w:w="2041"/>
+      </w:tblGrid>
+      <w:tr>
+        <w:trPr>
+          <w:trHeight w:val="299"/>
+          <w:tblHeader/>
+        </w:trPr>
+        <w:tc>
+          <w:tcPr>
+            <w:tcW w:w="968" w:type="dxa"/>
+            <w:shd w:val="clear" w:color="auto" w:fill="4C5FD5"/>
+            <w:tcMar>
+              <w:top w:w="30" w:type="dxa"/>
+              <w:left w:w="60" w:type="dxa"/>
+              <w:bottom w:w="30" w:type="dxa"/>
+              <w:right w:w="60" w:type="dxa"/>
+            </w:tcMar>
+            <w:vAlign w:val="center"/>
+          </w:tcPr>
+          <w:p>
+            <w:pPr>
+              <w:spacing w:before="20" w:after="20" w:line="220" w:lineRule="auto"/>
+              <w:jc w:val="center"/>
+              <w:rPr>
+                <w:b/>
+                <w:color w:val="FFFFFF"/>
+                <w:sz w:val="17"/>
+              </w:rPr>
+            </w:pPr>
+            <w:r>
+              <w:rPr>
+                <w:b/>
+                <w:color w:val="FFFFFF"/>
+                <w:sz w:val="17"/>
+              </w:rPr>
+              <w:t>Method</w:t>
+            </w:r>
+          </w:p>
+        </w:tc>
+        <w:tc>
+          <w:tcPr>
+            <w:tcW w:w="2851" w:type="dxa"/>
+            <w:shd w:val="clear" w:color="auto" w:fill="4C5FD5"/>
+            <w:tcMar>
+              <w:top w:w="30" w:type="dxa"/>
+              <w:left w:w="60" w:type="dxa"/>
+              <w:bottom w:w="30" w:type="dxa"/>
+              <w:right w:w="60" w:type="dxa"/>
+            </w:tcMar>
+            <w:vAlign w:val="center"/>
+          </w:tcPr>
+          <w:p>
+            <w:pPr>
+              <w:spacing w:before="20" w:after="20" w:line="220" w:lineRule="auto"/>
+              <w:jc w:val="center"/>
+              <w:rPr>
+                <w:b/>
+                <w:color w:val="FFFFFF"/>
+                <w:sz w:val="17"/>
+              </w:rPr>
+            </w:pPr>
+            <w:r>
+              <w:rPr>
+                <w:b/>
+                <w:color w:val="FFFFFF"/>
+                <w:sz w:val="17"/>
+              </w:rPr>
+              <w:t>Endpoint</w:t>
+            </w:r>
+          </w:p>
+        </w:tc>
+        <w:tc>
+          <w:tcPr>
+            <w:tcW w:w="4544" w:type="dxa"/>
+            <w:shd w:val="clear" w:color="auto" w:fill="4C5FD5"/>
+            <w:tcMar>
+              <w:top w:w="30" w:type="dxa"/>
+              <w:left w:w="60" w:type="dxa"/>
+              <w:bottom w:w="30" w:type="dxa"/>
+              <w:right w:w="60" w:type="dxa"/>
+            </w:tcMar>
+            <w:vAlign w:val="center"/>
+          </w:tcPr>
+          <w:p>
+            <w:pPr>
+              <w:spacing w:before="20" w:after="20" w:line="220" w:lineRule="auto"/>
+              <w:jc w:val="center"/>
+              <w:rPr>
+                <w:b/>
+                <w:color w:val="FFFFFF"/>
+                <w:sz w:val="17"/>
+              </w:rPr>
+            </w:pPr>
+            <w:r>
+              <w:rPr>
+                <w:b/>
+                <w:color w:val="FFFFFF"/>
+                <w:sz w:val="17"/>
+              </w:rPr>
+              <w:t>Request Body</w:t>
+            </w:r>
+          </w:p>
+        </w:tc>
+        <w:tc>
+          <w:tcPr>
+            <w:tcW w:w="2041" w:type="dxa"/>
+            <w:shd w:val="clear" w:color="auto" w:fill="4C5FD5"/>
+            <w:tcMar>
+              <w:top w:w="30" w:type="dxa"/>
+              <w:left w:w="60" w:type="dxa"/>
+              <w:bottom w:w="30" w:type="dxa"/>
+              <w:right w:w="60" w:type="dxa"/>
+            </w:tcMar>
+            <w:vAlign w:val="center"/>
+          </w:tcPr>
+          <w:p>
+            <w:pPr>
+              <w:spacing w:before="20" w:after="20" w:line="220" w:lineRule="auto"/>
+              <w:jc w:val="center"/>
+              <w:rPr>
+                <w:b/>
+                <w:color w:val="FFFFFF"/>
+                <w:sz w:val="17"/>
+              </w:rPr>
+            </w:pPr>
+            <w:r>
+              <w:rPr>
+                <w:b/>
+                <w:color w:val="FFFFFF"/>
+                <w:sz w:val="17"/>
+              </w:rPr>
+              <w:t>Notes</w:t>
+            </w:r>
+          </w:p>
+        </w:tc>
+      </w:tr>
+      <w:tr>
+        <w:trPr>
+          <w:trHeight w:val="274"/>
+        </w:trPr>
+        <w:tc>
+          <w:tcPr>
+            <w:tcW w:w="968" w:type="dxa"/>
+            <w:tcMar>
+              <w:top w:w="30" w:type="dxa"/>
+              <w:left w:w="60" w:type="dxa"/>
+              <w:bottom w:w="30" w:type="dxa"/>
+              <w:right w:w="60" w:type="dxa"/>
+            </w:tcMar>
+            <w:vAlign w:val="center"/>
+          </w:tcPr>
+          <w:p>
+            <w:pPr>
+              <w:spacing w:before="20" w:after="20" w:line="220" w:lineRule="auto"/>
+              <w:jc w:val="center"/>
+              <w:rPr>
+                <w:rFonts w:ascii="Consolas" w:hAnsi="Consolas" w:cs="Consolas"/>
+                <w:b/>
+                <w:sz w:val="16"/>
+              </w:rPr>
+            </w:pPr>
+            <w:r>
+              <w:rPr>
+                <w:rFonts w:ascii="Consolas" w:hAnsi="Consolas" w:cs="Consolas"/>
+                <w:b/>
+                <w:sz w:val="16"/>
+              </w:rPr>
+              <w:t>POST</w:t>
+            </w:r>
+          </w:p>
+        </w:tc>
+        <w:tc>
+          <w:tcPr>
+            <w:tcW w:w="2851" w:type="dxa"/>
+            <w:tcMar>
+              <w:top w:w="30" w:type="dxa"/>
+              <w:left w:w="60" w:type="dxa"/>
+              <w:bottom w:w="30" w:type="dxa"/>
+              <w:right w:w="60" w:type="dxa"/>
+            </w:tcMar>
+            <w:vAlign w:val="center"/>
+          </w:tcPr>
+          <w:p>
+            <w:pPr>
+              <w:spacing w:before="20" w:after="20" w:line="220" w:lineRule="auto"/>
+              <w:rPr>
+                <w:rFonts w:ascii="Consolas" w:hAnsi="Consolas" w:cs="Consolas"/>
+                <w:sz w:val="16"/>
+              </w:rPr>
+            </w:pPr>
+            <w:r>
+              <w:rPr>
+                <w:rFonts w:ascii="Consolas" w:hAnsi="Consolas" w:cs="Consolas"/>
+                <w:sz w:val="16"/>
+              </w:rPr>
+              <w:t>/users/register</w:t>
+            </w:r>
+          </w:p>
+        </w:tc>
+        <w:tc>
+          <w:tcPr>
+            <w:tcW w:w="4544" w:type="dxa"/>
+            <w:tcMar>
+              <w:top w:w="30" w:type="dxa"/>
+              <w:left w:w="60" w:type="dxa"/>
+              <w:bottom w:w="30" w:type="dxa"/>
+              <w:right w:w="60" w:type="dxa"/>
+            </w:tcMar>
+            <w:vAlign w:val="center"/>
+          </w:tcPr>
+          <w:p>
+            <w:pPr>
+              <w:spacing w:before="20" w:after="20" w:line="220" w:lineRule="auto"/>
+              <w:rPr>
+                <w:rFonts w:ascii="Consolas" w:hAnsi="Consolas" w:cs="Consolas"/>
+                <w:color w:val="7C3AED"/>
+                <w:sz w:val="16"/>
+              </w:rPr>
+            </w:pPr>
+            <w:r>
+              <w:rPr>
+                <w:rFonts w:ascii="Consolas" w:hAnsi="Consolas" w:cs="Consolas"/>
+                <w:color w:val="7C3AED"/>
+                <w:sz w:val="16"/>
+              </w:rPr>
+              <w:t>{"name": "alice"}</w:t>
+            </w:r>
+          </w:p>
+        </w:tc>
+        <w:tc>
+          <w:tcPr>
+            <w:tcW w:w="2041" w:type="dxa"/>
+            <w:tcMar>
+              <w:top w:w="30" w:type="dxa"/>
+              <w:left w:w="60" w:type="dxa"/>
+              <w:bottom w:w="30" w:type="dxa"/>
+              <w:right w:w="60" w:type="dxa"/>
+            </w:tcMar>
+            <w:vAlign w:val="center"/>
+          </w:tcPr>
+          <w:p>
+            <w:pPr>
+              <w:spacing w:before="20" w:after="20" w:line="220" w:lineRule="auto"/>
+              <w:rPr>
+                <w:sz w:val="16"/>
+              </w:rPr>
+            </w:pPr>
+            <w:r>
+              <w:rPr>
+                <w:sz w:val="16"/>
+              </w:rPr>
+              <w:t>Register a user.</w:t>
+            </w:r>
+          </w:p>
+        </w:tc>
+      </w:tr>
+      <w:tr>
+        <w:trPr>
+          <w:trHeight w:val="284"/>
+        </w:trPr>
+        <w:tc>
+          <w:tcPr>
+            <w:tcW w:w="968" w:type="dxa"/>
+            <w:tcMar>
+              <w:top w:w="30" w:type="dxa"/>
+              <w:left w:w="60" w:type="dxa"/>
+              <w:bottom w:w="30" w:type="dxa"/>
+              <w:right w:w="60" w:type="dxa"/>
+            </w:tcMar>
+            <w:vAlign w:val="center"/>
+          </w:tcPr>
+          <w:p>
+            <w:pPr>
+              <w:spacing w:before="20" w:after="20" w:line="220" w:lineRule="auto"/>
+              <w:jc w:val="center"/>
+              <w:rPr>
+                <w:rFonts w:ascii="Consolas" w:hAnsi="Consolas" w:cs="Consolas"/>
+                <w:b/>
+                <w:sz w:val="16"/>
+              </w:rPr>
+            </w:pPr>
+            <w:r>
+              <w:rPr>
+                <w:rFonts w:ascii="Consolas" w:hAnsi="Consolas" w:cs="Consolas"/>
+                <w:b/>
+                <w:sz w:val="16"/>
+              </w:rPr>
+              <w:t>POST</w:t>
+            </w:r>
+          </w:p>
+        </w:tc>
+        <w:tc>
+          <w:tcPr>
+            <w:tcW w:w="2851" w:type="dxa"/>
+            <w:tcMar>
+              <w:top w:w="30" w:type="dxa"/>
+              <w:left w:w="60" w:type="dxa"/>
+              <w:bottom w:w="30" w:type="dxa"/>
+              <w:right w:w="60" w:type="dxa"/>
+            </w:tcMar>
+            <w:vAlign w:val="center"/>
+          </w:tcPr>
+          <w:p>
+            <w:pPr>
+              <w:spacing w:before="20" w:after="20" w:line="220" w:lineRule="auto"/>
+              <w:rPr>
+                <w:rFonts w:ascii="Consolas" w:hAnsi="Consolas" w:cs="Consolas"/>
+                <w:sz w:val="16"/>
+              </w:rPr>
+            </w:pPr>
+            <w:r>
+              <w:rPr>
+                <w:rFonts w:ascii="Consolas" w:hAnsi="Consolas" w:cs="Consolas"/>
+                <w:sz w:val="16"/>
+              </w:rPr>
+              <w:t>/users/deposit</w:t>
+            </w:r>
+          </w:p>
+        </w:tc>
+        <w:tc>
+          <w:tcPr>
+            <w:tcW w:w="4544" w:type="dxa"/>
+            <w:tcMar>
+              <w:top w:w="30" w:type="dxa"/>
+              <w:left w:w="60" w:type="dxa"/>
+              <w:bottom w:w="30" w:type="dxa"/>
+              <w:right w:w="60" w:type="dxa"/>
+            </w:tcMar>
+            <w:vAlign w:val="center"/>
+          </w:tcPr>
+          <w:p>
+            <w:pPr>
+              <w:spacing w:before="20" w:after="20" w:line="220" w:lineRule="auto"/>
+              <w:rPr>
+                <w:rFonts w:ascii="Consolas" w:hAnsi="Consolas" w:cs="Consolas"/>
+                <w:color w:val="7C3AED"/>
+                <w:sz w:val="16"/>
+              </w:rPr>
+            </w:pPr>
+            <w:r>
+              <w:rPr>
+                <w:rFonts w:ascii="Consolas" w:hAnsi="Consolas" w:cs="Consolas"/>
+                <w:color w:val="7C3AED"/>
+                <w:sz w:val="16"/>
+              </w:rPr>
+              <w:t>{"userName": "alice", "amount": 100}</w:t>
+            </w:r>
+          </w:p>
+        </w:tc>
+        <w:tc>
+          <w:tcPr>
+            <w:tcW w:w="2041" w:type="dxa"/>
+            <w:tcMar>
+              <w:top w:w="30" w:type="dxa"/>
+              <w:left w:w="60" w:type="dxa"/>
+              <w:bottom w:w="30" w:type="dxa"/>
+              <w:right w:w="60" w:type="dxa"/>
+            </w:tcMar>
+            <w:vAlign w:val="center"/>
+          </w:tcPr>
+          <w:p>
+            <w:pPr>
+              <w:spacing w:before="20" w:after="20" w:line="220" w:lineRule="auto"/>
+              <w:rPr>
+                <w:sz w:val="16"/>
+              </w:rPr>
+            </w:pPr>
+            <w:r>
+              <w:rPr>
+                <w:sz w:val="16"/>
+              </w:rPr>
+              <w:t>Add cash to a balance.</w:t>
+            </w:r>
+          </w:p>
+        </w:tc>
+      </w:tr>
+      <w:tr>
+        <w:trPr>
+          <w:trHeight w:val="284"/>
+        </w:trPr>
+        <w:tc>
+          <w:tcPr>
+            <w:tcW w:w="968" w:type="dxa"/>
+            <w:tcMar>
+              <w:top w:w="30" w:type="dxa"/>
+              <w:left w:w="60" w:type="dxa"/>
+              <w:bottom w:w="30" w:type="dxa"/>
+              <w:right w:w="60" w:type="dxa"/>
+            </w:tcMar>
+            <w:vAlign w:val="center"/>
+          </w:tcPr>
+          <w:p>
+            <w:pPr>
+              <w:spacing w:before="20" w:after="20" w:line="220" w:lineRule="auto"/>
+              <w:jc w:val="center"/>
+              <w:rPr>
+                <w:rFonts w:ascii="Consolas" w:hAnsi="Consolas" w:cs="Consolas"/>
+                <w:b/>
+                <w:sz w:val="16"/>
+              </w:rPr>
+            </w:pPr>
+            <w:r>
+              <w:rPr>
+                <w:rFonts w:ascii="Consolas" w:hAnsi="Consolas" w:cs="Consolas"/>
+                <w:b/>
+                <w:sz w:val="16"/>
+              </w:rPr>
+              <w:t>GET</w:t>
+            </w:r>
+          </w:p>
+        </w:tc>
+        <w:tc>
+          <w:tcPr>
+            <w:tcW w:w="2851" w:type="dxa"/>
+            <w:tcMar>
+              <w:top w:w="30" w:type="dxa"/>
+              <w:left w:w="60" w:type="dxa"/>
+              <w:bottom w:w="30" w:type="dxa"/>
+              <w:right w:w="60" w:type="dxa"/>
+            </w:tcMar>
+            <w:vAlign w:val="center"/>
+          </w:tcPr>
+          <w:p>
+            <w:pPr>
+              <w:spacing w:before="20" w:after="20" w:line="220" w:lineRule="auto"/>
+              <w:rPr>
+                <w:rFonts w:ascii="Consolas" w:hAnsi="Consolas" w:cs="Consolas"/>
+                <w:sz w:val="16"/>
+              </w:rPr>
+            </w:pPr>
+            <w:r>
+              <w:rPr>
+                <w:rFonts w:ascii="Consolas" w:hAnsi="Consolas" w:cs="Consolas"/>
+                <w:sz w:val="16"/>
+              </w:rPr>
+              <w:t>/users</w:t>
+            </w:r>
+          </w:p>
+        </w:tc>
+        <w:tc>
+          <w:tcPr>
+            <w:tcW w:w="4544" w:type="dxa"/>
+            <w:tcMar>
+              <w:top w:w="30" w:type="dxa"/>
+              <w:left w:w="60" w:type="dxa"/>
+              <w:bottom w:w="30" w:type="dxa"/>
+              <w:right w:w="60" w:type="dxa"/>
+            </w:tcMar>
+            <w:vAlign w:val="center"/>
+          </w:tcPr>
+          <w:p>
+            <w:pPr>
+              <w:spacing w:before="20" w:after="20" w:line="220" w:lineRule="auto"/>
+              <w:rPr>
+                <w:rFonts w:ascii="Consolas" w:hAnsi="Consolas" w:cs="Consolas"/>
+                <w:color w:val="7C3AED"/>
+                <w:sz w:val="16"/>
+              </w:rPr>
+            </w:pPr>
+            <w:r>
+              <w:rPr>
+                <w:rFonts w:ascii="Consolas" w:hAnsi="Consolas" w:cs="Consolas"/>
+                <w:color w:val="7C3AED"/>
+                <w:sz w:val="16"/>
+              </w:rPr>
+              <w:t>-</w:t>
+            </w:r>
+          </w:p>
+        </w:tc>
+        <w:tc>
+          <w:tcPr>
+            <w:tcW w:w="2041" w:type="dxa"/>
+            <w:tcMar>
+              <w:top w:w="30" w:type="dxa"/>
+              <w:left w:w="60" w:type="dxa"/>
+              <w:bottom w:w="30" w:type="dxa"/>
+              <w:right w:w="60" w:type="dxa"/>
+            </w:tcMar>
+            <w:vAlign w:val="center"/>
+          </w:tcPr>
+          <w:p>
+            <w:pPr>
+              <w:spacing w:before="20" w:after="20" w:line="220" w:lineRule="auto"/>
+              <w:rPr>
+                <w:sz w:val="16"/>
+              </w:rPr>
+            </w:pPr>
+            <w:r>
+              <w:rPr>
+                <w:sz w:val="16"/>
+              </w:rPr>
+              <w:t>List all users.</w:t>
+            </w:r>
+          </w:p>
+        </w:tc>
+      </w:tr>
+      <w:tr>
+        <w:trPr>
+          <w:trHeight w:val="511"/>
+        </w:trPr>
+        <w:tc>
+          <w:tcPr>
+            <w:tcW w:w="968" w:type="dxa"/>
+            <w:tcMar>
+              <w:top w:w="30" w:type="dxa"/>
+              <w:left w:w="60" w:type="dxa"/>
+              <w:bottom w:w="30" w:type="dxa"/>
+              <w:right w:w="60" w:type="dxa"/>
+            </w:tcMar>
+            <w:vAlign w:val="center"/>
+          </w:tcPr>
+          <w:p>
+            <w:pPr>
+              <w:spacing w:before="20" w:after="20" w:line="220" w:lineRule="auto"/>
+              <w:jc w:val="center"/>
+              <w:rPr>
+                <w:rFonts w:ascii="Consolas" w:hAnsi="Consolas" w:cs="Consolas"/>
+                <w:b/>
+                <w:sz w:val="16"/>
+              </w:rPr>
+            </w:pPr>
+            <w:r>
+              <w:rPr>
+                <w:rFonts w:ascii="Consolas" w:hAnsi="Consolas" w:cs="Consolas"/>
+                <w:b/>
+                <w:sz w:val="16"/>
+              </w:rPr>
+              <w:t>POST</w:t>
+            </w:r>
+          </w:p>
+        </w:tc>
+        <w:tc>
+          <w:tcPr>
+            <w:tcW w:w="2851" w:type="dxa"/>
+            <w:tcMar>
+              <w:top w:w="30" w:type="dxa"/>
+              <w:left w:w="60" w:type="dxa"/>
+              <w:bottom w:w="30" w:type="dxa"/>
+              <w:right w:w="60" w:type="dxa"/>
+            </w:tcMar>
+            <w:vAlign w:val="center"/>
+          </w:tcPr>
+          <w:p>
+            <w:pPr>
+              <w:spacing w:before="20" w:after="20" w:line="220" w:lineRule="auto"/>
+              <w:rPr>
+                <w:rFonts w:ascii="Consolas" w:hAnsi="Consolas" w:cs="Consolas"/>
+                <w:sz w:val="16"/>
+              </w:rPr>
+            </w:pPr>
+            <w:r>
+              <w:rPr>
+                <w:rFonts w:ascii="Consolas" w:hAnsi="Consolas" w:cs="Consolas"/>
+                <w:sz w:val="16"/>
+              </w:rPr>
+              <w:t>/upload?uploaderName=</w:t>
+            </w:r>
+            <w:r>
+              <w:rPr>
+                <w:rFonts w:ascii="Consolas" w:hAnsi="Consolas" w:cs="Consolas"/>
+                <w:color w:val="4EA72E" w:themeColor="accent6"/>
+                <w:sz w:val="16"/>
+              </w:rPr>
+              <w:t>X</w:t>
+            </w:r>
+          </w:p>
+          <w:p>
+            <w:pPr>
+              <w:spacing w:before="20" w:after="20" w:line="220" w:lineRule="auto"/>
+              <w:rPr>
+                <w:rFonts w:ascii="Consolas" w:hAnsi="Consolas" w:cs="Consolas"/>
+                <w:sz w:val="16"/>
+              </w:rPr>
+            </w:pPr>
+            <w:r>
+              <w:rPr>
+                <w:rFonts w:ascii="Consolas" w:hAnsi="Consolas" w:cs="Consolas"/>
+                <w:sz w:val="16"/>
+              </w:rPr>
+              <w:t>(change '</w:t>
+            </w:r>
+            <w:r>
+              <w:rPr>
+                <w:rFonts w:ascii="Consolas" w:hAnsi="Consolas" w:cs="Consolas"/>
+                <w:color w:val="4EA72E" w:themeColor="accent6"/>
+                <w:sz w:val="16"/>
+              </w:rPr>
+              <w:t>X</w:t>
+            </w:r>
+            <w:r>
+              <w:rPr>
+                <w:rFonts w:ascii="Consolas" w:hAnsi="Consolas" w:cs="Consolas"/>
+                <w:sz w:val="16"/>
+              </w:rPr>
+              <w:t>' for actual name)</w:t>
+            </w:r>
+          </w:p>
+        </w:tc>
+        <w:tc>
+          <w:tcPr>
+            <w:tcW w:w="4544" w:type="dxa"/>
+            <w:tcMar>
+              <w:top w:w="30" w:type="dxa"/>
+              <w:left w:w="60" w:type="dxa"/>
+              <w:bottom w:w="30" w:type="dxa"/>
+              <w:right w:w="60" w:type="dxa"/>
+            </w:tcMar>
+            <w:vAlign w:val="center"/>
+          </w:tcPr>
+          <w:p>
+            <w:pPr>
+              <w:spacing w:before="20" w:after="20" w:line="220" w:lineRule="auto"/>
+              <w:rPr>
+                <w:rFonts w:ascii="Consolas" w:hAnsi="Consolas" w:cs="Consolas"/>
+                <w:color w:val="7C3AED"/>
+                <w:sz w:val="16"/>
+              </w:rPr>
+            </w:pPr>
+            <w:r>
+              <w:rPr>
+                <w:rFonts w:ascii="Consolas" w:hAnsi="Consolas" w:cs="Consolas"/>
+                <w:color w:val="7C3AED"/>
+                <w:sz w:val="16"/>
+              </w:rPr>
+              <w:t>(raw XML file as the request body)</w:t>
+            </w:r>
+          </w:p>
+        </w:tc>
+        <w:tc>
+          <w:tcPr>
+            <w:tcW w:w="2041" w:type="dxa"/>
+            <w:tcMar>
+              <w:top w:w="30" w:type="dxa"/>
+              <w:left w:w="60" w:type="dxa"/>
+              <w:bottom w:w="30" w:type="dxa"/>
+              <w:right w:w="60" w:type="dxa"/>
+            </w:tcMar>
+            <w:vAlign w:val="center"/>
+          </w:tcPr>
+          <w:p>
+            <w:pPr>
+              <w:spacing w:before="20" w:after="20" w:line="220" w:lineRule="auto"/>
+              <w:rPr>
+                <w:sz w:val="16"/>
+              </w:rPr>
+            </w:pPr>
+            <w:r>
+              <w:rPr>
+                <w:sz w:val="16"/>
+              </w:rPr>
+              <w:t>Upload events from an XML file.</w:t>
+            </w:r>
+          </w:p>
+        </w:tc>
+      </w:tr>
+      <w:tr>
+        <w:trPr>
+          <w:trHeight w:val="284"/>
+        </w:trPr>
+        <w:tc>
+          <w:tcPr>
+            <w:tcW w:w="968" w:type="dxa"/>
+            <w:tcMar>
+              <w:top w:w="30" w:type="dxa"/>
+              <w:left w:w="60" w:type="dxa"/>
+              <w:bottom w:w="30" w:type="dxa"/>
+              <w:right w:w="60" w:type="dxa"/>
+            </w:tcMar>
+            <w:vAlign w:val="center"/>
+          </w:tcPr>
+          <w:p>
+            <w:pPr>
+              <w:spacing w:before="20" w:after="20" w:line="220" w:lineRule="auto"/>
+              <w:jc w:val="center"/>
+              <w:rPr>
+                <w:rFonts w:ascii="Consolas" w:hAnsi="Consolas" w:cs="Consolas"/>
+                <w:b/>
+                <w:sz w:val="16"/>
+              </w:rPr>
+            </w:pPr>
+            <w:r>
+              <w:rPr>
+                <w:rFonts w:ascii="Consolas" w:hAnsi="Consolas" w:cs="Consolas"/>
+                <w:b/>
+                <w:sz w:val="16"/>
+              </w:rPr>
+              <w:t>GET</w:t>
+            </w:r>
+          </w:p>
+        </w:tc>
+        <w:tc>
+          <w:tcPr>
+            <w:tcW w:w="2851" w:type="dxa"/>
+            <w:tcMar>
+              <w:top w:w="30" w:type="dxa"/>
+              <w:left w:w="60" w:type="dxa"/>
+              <w:bottom w:w="30" w:type="dxa"/>
+              <w:right w:w="60" w:type="dxa"/>
+            </w:tcMar>
+            <w:vAlign w:val="center"/>
+          </w:tcPr>
+          <w:p>
+            <w:pPr>
+              <w:spacing w:before="20" w:after="20" w:line="220" w:lineRule="auto"/>
+              <w:rPr>
+                <w:rFonts w:ascii="Consolas" w:hAnsi="Consolas" w:cs="Consolas"/>
+                <w:sz w:val="16"/>
+              </w:rPr>
+            </w:pPr>
+            <w:r>
+              <w:rPr>
+                <w:rFonts w:ascii="Consolas" w:hAnsi="Consolas" w:cs="Consolas"/>
+                <w:sz w:val="16"/>
+              </w:rPr>
+              <w:t>/events</w:t>
+            </w:r>
+          </w:p>
+        </w:tc>
+        <w:tc>
+          <w:tcPr>
+            <w:tcW w:w="4544" w:type="dxa"/>
+            <w:tcMar>
+              <w:top w:w="30" w:type="dxa"/>
+              <w:left w:w="60" w:type="dxa"/>
+              <w:bottom w:w="30" w:type="dxa"/>
+              <w:right w:w="60" w:type="dxa"/>
+            </w:tcMar>
+            <w:vAlign w:val="center"/>
+          </w:tcPr>
+          <w:p>
+            <w:pPr>
+              <w:spacing w:before="20" w:after="20" w:line="220" w:lineRule="auto"/>
+              <w:rPr>
+                <w:rFonts w:ascii="Consolas" w:hAnsi="Consolas" w:cs="Consolas"/>
+                <w:color w:val="7C3AED"/>
+                <w:sz w:val="16"/>
+              </w:rPr>
+            </w:pPr>
+            <w:r>
+              <w:rPr>
+                <w:rFonts w:ascii="Consolas" w:hAnsi="Consolas" w:cs="Consolas"/>
+                <w:color w:val="7C3AED"/>
+                <w:sz w:val="16"/>
+              </w:rPr>
+              <w:t>-</w:t>
+            </w:r>
+          </w:p>
+        </w:tc>
+        <w:tc>
+          <w:tcPr>
+            <w:tcW w:w="2041" w:type="dxa"/>
+            <w:tcMar>
+              <w:top w:w="30" w:type="dxa"/>
+              <w:left w:w="60" w:type="dxa"/>
+              <w:bottom w:w="30" w:type="dxa"/>
+              <w:right w:w="60" w:type="dxa"/>
+            </w:tcMar>
+            <w:vAlign w:val="center"/>
+          </w:tcPr>
+          <w:p>
+            <w:pPr>
+              <w:spacing w:before="20" w:after="20" w:line="220" w:lineRule="auto"/>
+              <w:rPr>
+                <w:sz w:val="16"/>
+              </w:rPr>
+            </w:pPr>
+            <w:r>
+              <w:rPr>
+                <w:sz w:val="16"/>
+              </w:rPr>
+              <w:t>List all events.</w:t>
+            </w:r>
+          </w:p>
+        </w:tc>
+      </w:tr>
+      <w:tr>
+        <w:trPr>
+          <w:trHeight w:val="284"/>
+        </w:trPr>
+        <w:tc>
+          <w:tcPr>
+            <w:tcW w:w="968" w:type="dxa"/>
+            <w:tcMar>
+              <w:top w:w="30" w:type="dxa"/>
+              <w:left w:w="60" w:type="dxa"/>
+              <w:bottom w:w="30" w:type="dxa"/>
+              <w:right w:w="60" w:type="dxa"/>
+            </w:tcMar>
+            <w:vAlign w:val="center"/>
+          </w:tcPr>
+          <w:p>
+            <w:pPr>
+              <w:spacing w:before="20" w:after="20" w:line="220" w:lineRule="auto"/>
+              <w:jc w:val="center"/>
+              <w:rPr>
+                <w:rFonts w:ascii="Consolas" w:hAnsi="Consolas" w:cs="Consolas"/>
+                <w:b/>
+                <w:sz w:val="16"/>
+              </w:rPr>
+            </w:pPr>
+            <w:r>
+              <w:rPr>
+                <w:rFonts w:ascii="Consolas" w:hAnsi="Consolas" w:cs="Consolas"/>
+                <w:b/>
+                <w:sz w:val="16"/>
+              </w:rPr>
+              <w:t>GET</w:t>
+            </w:r>
+          </w:p>
+        </w:tc>
+        <w:tc>
+          <w:tcPr>
+            <w:tcW w:w="2851" w:type="dxa"/>
+            <w:tcMar>
+              <w:top w:w="30" w:type="dxa"/>
+              <w:left w:w="60" w:type="dxa"/>
+              <w:bottom w:w="30" w:type="dxa"/>
+              <w:right w:w="60" w:type="dxa"/>
+            </w:tcMar>
+            <w:vAlign w:val="center"/>
+          </w:tcPr>
+          <w:p>
+            <w:pPr>
+              <w:spacing w:before="20" w:after="20" w:line="220" w:lineRule="auto"/>
+              <w:rPr>
+                <w:rFonts w:ascii="Consolas" w:hAnsi="Consolas" w:cs="Consolas"/>
+                <w:sz w:val="16"/>
+              </w:rPr>
+            </w:pPr>
+            <w:r>
+              <w:rPr>
+                <w:rFonts w:ascii="Consolas" w:hAnsi="Consolas" w:cs="Consolas"/>
+                <w:sz w:val="16"/>
+              </w:rPr>
+              <w:t>/events?name=</w:t>
+            </w:r>
+            <w:r>
+              <w:rPr>
+                <w:rFonts w:ascii="Consolas" w:hAnsi="Consolas" w:cs="Consolas"/>
+                <w:color w:val="4EA72E" w:themeColor="accent6"/>
+                <w:sz w:val="16"/>
+              </w:rPr>
+              <w:t>X</w:t>
+            </w:r>
+          </w:p>
+          <w:p>
+            <w:pPr>
+              <w:spacing w:before="20" w:after="20" w:line="220" w:lineRule="auto"/>
+              <w:rPr>
+                <w:rFonts w:ascii="Consolas" w:hAnsi="Consolas" w:cs="Consolas"/>
+                <w:sz w:val="16"/>
+              </w:rPr>
+            </w:pPr>
+            <w:r>
+              <w:rPr>
+                <w:rFonts w:ascii="Consolas" w:hAnsi="Consolas" w:cs="Consolas"/>
+                <w:sz w:val="16"/>
+              </w:rPr>
+              <w:t>(change '</w:t>
+            </w:r>
+            <w:r>
+              <w:rPr>
+                <w:rFonts w:ascii="Consolas" w:hAnsi="Consolas" w:cs="Consolas"/>
+                <w:color w:val="4EA72E" w:themeColor="accent6"/>
+                <w:sz w:val="16"/>
+              </w:rPr>
+              <w:t>X</w:t>
+            </w:r>
+            <w:r>
+              <w:rPr>
+                <w:rFonts w:ascii="Consolas" w:hAnsi="Consolas" w:cs="Consolas"/>
+                <w:sz w:val="16"/>
+              </w:rPr>
+              <w:t>' for actual name)</w:t>
+            </w:r>
+          </w:p>
+        </w:tc>
+        <w:tc>
+          <w:tcPr>
+            <w:tcW w:w="4544" w:type="dxa"/>
+            <w:tcMar>
+              <w:top w:w="30" w:type="dxa"/>
+              <w:left w:w="60" w:type="dxa"/>
+              <w:bottom w:w="30" w:type="dxa"/>
+              <w:right w:w="60" w:type="dxa"/>
+            </w:tcMar>
+            <w:vAlign w:val="center"/>
+          </w:tcPr>
+          <w:p>
+            <w:pPr>
+              <w:spacing w:before="20" w:after="20" w:line="220" w:lineRule="auto"/>
+              <w:rPr>
+                <w:rFonts w:ascii="Consolas" w:hAnsi="Consolas" w:cs="Consolas"/>
+                <w:color w:val="7C3AED"/>
+                <w:sz w:val="16"/>
+              </w:rPr>
+            </w:pPr>
+            <w:r>
+              <w:rPr>
+                <w:rFonts w:ascii="Consolas" w:hAnsi="Consolas" w:cs="Consolas"/>
+                <w:color w:val="7C3AED"/>
+                <w:sz w:val="16"/>
+              </w:rPr>
+              <w:t>-</w:t>
+            </w:r>
+          </w:p>
+        </w:tc>
+        <w:tc>
+          <w:tcPr>
+            <w:tcW w:w="2041" w:type="dxa"/>
+            <w:tcMar>
+              <w:top w:w="30" w:type="dxa"/>
+              <w:left w:w="60" w:type="dxa"/>
+              <w:bottom w:w="30" w:type="dxa"/>
+              <w:right w:w="60" w:type="dxa"/>
+            </w:tcMar>
+            <w:vAlign w:val="center"/>
+          </w:tcPr>
+          <w:p>
+            <w:pPr>
+              <w:spacing w:before="20" w:after="20" w:line="220" w:lineRule="auto"/>
+              <w:rPr>
+                <w:sz w:val="16"/>
+              </w:rPr>
+            </w:pPr>
+            <w:r>
+              <w:rPr>
+                <w:sz w:val="16"/>
+              </w:rPr>
+              <w:t>One event's full details.</w:t>
+            </w:r>
+          </w:p>
+        </w:tc>
+      </w:tr>
+      <w:tr>
+        <w:trPr>
+          <w:trHeight w:val="284"/>
+        </w:trPr>
+        <w:tc>
+          <w:tcPr>
+            <w:tcW w:w="968" w:type="dxa"/>
+            <w:tcMar>
+              <w:top w:w="30" w:type="dxa"/>
+              <w:left w:w="60" w:type="dxa"/>
+              <w:bottom w:w="30" w:type="dxa"/>
+              <w:right w:w="60" w:type="dxa"/>
+            </w:tcMar>
+            <w:vAlign w:val="center"/>
+          </w:tcPr>
+          <w:p>
+            <w:pPr>
+              <w:spacing w:before="20" w:after="20" w:line="220" w:lineRule="auto"/>
+              <w:jc w:val="center"/>
+              <w:rPr>
+                <w:rFonts w:ascii="Consolas" w:hAnsi="Consolas" w:cs="Consolas"/>
+                <w:b/>
+                <w:sz w:val="16"/>
+              </w:rPr>
+            </w:pPr>
+            <w:r>
+              <w:rPr>
+                <w:rFonts w:ascii="Consolas" w:hAnsi="Consolas" w:cs="Consolas"/>
+                <w:b/>
+                <w:sz w:val="16"/>
+              </w:rPr>
+              <w:t>POST</w:t>
+            </w:r>
+          </w:p>
+        </w:tc>
+        <w:tc>
+          <w:tcPr>
+            <w:tcW w:w="2851" w:type="dxa"/>
+            <w:tcMar>
+              <w:top w:w="30" w:type="dxa"/>
+              <w:left w:w="60" w:type="dxa"/>
+              <w:bottom w:w="30" w:type="dxa"/>
+              <w:right w:w="60" w:type="dxa"/>
+            </w:tcMar>
+            <w:vAlign w:val="center"/>
+          </w:tcPr>
+          <w:p>
+            <w:pPr>
+              <w:spacing w:before="20" w:after="20" w:line="220" w:lineRule="auto"/>
+              <w:rPr>
+                <w:rFonts w:ascii="Consolas" w:hAnsi="Consolas" w:cs="Consolas"/>
+                <w:sz w:val="16"/>
+              </w:rPr>
+            </w:pPr>
+            <w:r>
+              <w:rPr>
+                <w:rFonts w:ascii="Consolas" w:hAnsi="Consolas" w:cs="Consolas"/>
+                <w:sz w:val="16"/>
+              </w:rPr>
+              <w:t>/events/open</w:t>
+            </w:r>
+          </w:p>
+        </w:tc>
+        <w:tc>
+          <w:tcPr>
+            <w:tcW w:w="4544" w:type="dxa"/>
+            <w:tcMar>
+              <w:top w:w="30" w:type="dxa"/>
+              <w:left w:w="60" w:type="dxa"/>
+              <w:bottom w:w="30" w:type="dxa"/>
+              <w:right w:w="60" w:type="dxa"/>
+            </w:tcMar>
+            <w:vAlign w:val="center"/>
+          </w:tcPr>
+          <w:p>
+            <w:pPr>
+              <w:spacing w:before="20" w:after="20" w:line="220" w:lineRule="auto"/>
+              <w:rPr>
+                <w:rFonts w:ascii="Consolas" w:hAnsi="Consolas" w:cs="Consolas"/>
+                <w:color w:val="7C3AED"/>
+                <w:sz w:val="16"/>
+              </w:rPr>
+            </w:pPr>
+            <w:r>
+              <w:rPr>
+                <w:rFonts w:ascii="Consolas" w:hAnsi="Consolas" w:cs="Consolas"/>
+                <w:color w:val="7C3AED"/>
+                <w:sz w:val="16"/>
+              </w:rPr>
+              <w:t>{"mmName": "alice", "eventName": "X"}</w:t>
+            </w:r>
+          </w:p>
+        </w:tc>
+        <w:tc>
+          <w:tcPr>
+            <w:tcW w:w="2041" w:type="dxa"/>
+            <w:tcMar>
+              <w:top w:w="30" w:type="dxa"/>
+              <w:left w:w="60" w:type="dxa"/>
+              <w:bottom w:w="30" w:type="dxa"/>
+              <w:right w:w="60" w:type="dxa"/>
+            </w:tcMar>
+            <w:vAlign w:val="center"/>
+          </w:tcPr>
+          <w:p>
+            <w:pPr>
+              <w:spacing w:before="20" w:after="20" w:line="220" w:lineRule="auto"/>
+              <w:rPr>
+                <w:sz w:val="16"/>
+              </w:rPr>
+            </w:pPr>
+            <w:r>
+              <w:rPr>
+                <w:sz w:val="16"/>
+              </w:rPr>
+              <w:t>MM opens the event.</w:t>
+            </w:r>
+          </w:p>
+        </w:tc>
+      </w:tr>
+      <w:tr>
+        <w:trPr>
+          <w:trHeight w:val="511"/>
+        </w:trPr>
+        <w:tc>
+          <w:tcPr>
+            <w:tcW w:w="968" w:type="dxa"/>
+            <w:tcMar>
+              <w:top w:w="30" w:type="dxa"/>
+              <w:left w:w="60" w:type="dxa"/>
+              <w:bottom w:w="30" w:type="dxa"/>
+              <w:right w:w="60" w:type="dxa"/>
+            </w:tcMar>
+            <w:vAlign w:val="center"/>
+          </w:tcPr>
+          <w:p>
+            <w:pPr>
+              <w:spacing w:before="20" w:after="20" w:line="220" w:lineRule="auto"/>
+              <w:jc w:val="center"/>
+              <w:rPr>
+                <w:rFonts w:ascii="Consolas" w:hAnsi="Consolas" w:cs="Consolas"/>
+                <w:b/>
+                <w:sz w:val="16"/>
+              </w:rPr>
+            </w:pPr>
+            <w:r>
+              <w:rPr>
+                <w:rFonts w:ascii="Consolas" w:hAnsi="Consolas" w:cs="Consolas"/>
+                <w:b/>
+                <w:sz w:val="16"/>
+              </w:rPr>
+              <w:t>POST</w:t>
+            </w:r>
+          </w:p>
+        </w:tc>
+        <w:tc>
+          <w:tcPr>
+            <w:tcW w:w="2851" w:type="dxa"/>
+            <w:tcMar>
+              <w:top w:w="30" w:type="dxa"/>
+              <w:left w:w="60" w:type="dxa"/>
+              <w:bottom w:w="30" w:type="dxa"/>
+              <w:right w:w="60" w:type="dxa"/>
+            </w:tcMar>
+            <w:vAlign w:val="center"/>
+          </w:tcPr>
+          <w:p>
+            <w:pPr>
+              <w:spacing w:before="20" w:after="20" w:line="220" w:lineRule="auto"/>
+              <w:rPr>
+                <w:rFonts w:ascii="Consolas" w:hAnsi="Consolas" w:cs="Consolas"/>
+                <w:sz w:val="16"/>
+              </w:rPr>
+            </w:pPr>
+            <w:r>
+              <w:rPr>
+                <w:rFonts w:ascii="Consolas" w:hAnsi="Consolas" w:cs="Consolas"/>
+                <w:sz w:val="16"/>
+              </w:rPr>
+              <w:t>/events/close</w:t>
+            </w:r>
+          </w:p>
+        </w:tc>
+        <w:tc>
+          <w:tcPr>
+            <w:tcW w:w="4544" w:type="dxa"/>
+            <w:tcMar>
+              <w:top w:w="30" w:type="dxa"/>
+              <w:left w:w="60" w:type="dxa"/>
+              <w:bottom w:w="30" w:type="dxa"/>
+              <w:right w:w="60" w:type="dxa"/>
+            </w:tcMar>
+            <w:vAlign w:val="center"/>
+          </w:tcPr>
+          <w:p>
+            <w:pPr>
+              <w:spacing w:before="20" w:after="20" w:line="220" w:lineRule="auto"/>
+              <w:rPr>
+                <w:rFonts w:ascii="Consolas" w:hAnsi="Consolas" w:cs="Consolas"/>
+                <w:color w:val="7C3AED"/>
+                <w:sz w:val="16"/>
+              </w:rPr>
+            </w:pPr>
+            <w:r>
+              <w:rPr>
+                <w:rFonts w:ascii="Consolas" w:hAnsi="Consolas" w:cs="Consolas"/>
+                <w:color w:val="7C3AED"/>
+                <w:sz w:val="16"/>
+              </w:rPr>
+              <w:t>{"mmName": "alice", "eventName": "X", "winningOptionIndex": 0}</w:t>
+            </w:r>
+          </w:p>
+        </w:tc>
+        <w:tc>
+          <w:tcPr>
+            <w:tcW w:w="2041" w:type="dxa"/>
+            <w:tcMar>
+              <w:top w:w="30" w:type="dxa"/>
+              <w:left w:w="60" w:type="dxa"/>
+              <w:bottom w:w="30" w:type="dxa"/>
+              <w:right w:w="60" w:type="dxa"/>
+            </w:tcMar>
+            <w:vAlign w:val="center"/>
+          </w:tcPr>
+          <w:p>
+            <w:pPr>
+              <w:spacing w:before="20" w:after="20" w:line="220" w:lineRule="auto"/>
+              <w:rPr>
+                <w:sz w:val="16"/>
+              </w:rPr>
+            </w:pPr>
+            <w:r>
+              <w:rPr>
+                <w:sz w:val="16"/>
+              </w:rPr>
+              <w:t>MM closes it, picks the winner.</w:t>
+            </w:r>
+          </w:p>
+        </w:tc>
+      </w:tr>
+      <w:tr>
+        <w:trPr>
+          <w:trHeight w:val="511"/>
+        </w:trPr>
+        <w:tc>
+          <w:tcPr>
+            <w:tcW w:w="968" w:type="dxa"/>
+            <w:tcMar>
+              <w:top w:w="30" w:type="dxa"/>
+              <w:left w:w="60" w:type="dxa"/>
+              <w:bottom w:w="30" w:type="dxa"/>
+              <w:right w:w="60" w:type="dxa"/>
+            </w:tcMar>
+            <w:vAlign w:val="center"/>
+          </w:tcPr>
+          <w:p>
+            <w:pPr>
+              <w:spacing w:before="20" w:after="20" w:line="220" w:lineRule="auto"/>
+              <w:jc w:val="center"/>
+              <w:rPr>
+                <w:rFonts w:ascii="Consolas" w:hAnsi="Consolas" w:cs="Consolas"/>
+                <w:b/>
+                <w:sz w:val="16"/>
+              </w:rPr>
+            </w:pPr>
+            <w:r>
+              <w:rPr>
+                <w:rFonts w:ascii="Consolas" w:hAnsi="Consolas" w:cs="Consolas"/>
+                <w:b/>
+                <w:sz w:val="16"/>
+              </w:rPr>
+              <w:t>POST</w:t>
+            </w:r>
+          </w:p>
+        </w:tc>
+        <w:tc>
+          <w:tcPr>
+            <w:tcW w:w="2851" w:type="dxa"/>
+            <w:tcMar>
+              <w:top w:w="30" w:type="dxa"/>
+              <w:left w:w="60" w:type="dxa"/>
+              <w:bottom w:w="30" w:type="dxa"/>
+              <w:right w:w="60" w:type="dxa"/>
+            </w:tcMar>
+            <w:vAlign w:val="center"/>
+          </w:tcPr>
+          <w:p>
+            <w:pPr>
+              <w:spacing w:before="20" w:after="20" w:line="220" w:lineRule="auto"/>
+              <w:rPr>
+                <w:rFonts w:ascii="Consolas" w:hAnsi="Consolas" w:cs="Consolas"/>
+                <w:sz w:val="16"/>
+              </w:rPr>
+            </w:pPr>
+            <w:r>
+              <w:rPr>
+                <w:rFonts w:ascii="Consolas" w:hAnsi="Consolas" w:cs="Consolas"/>
+                <w:sz w:val="16"/>
+              </w:rPr>
+              <w:t>/events/buy</w:t>
+            </w:r>
+          </w:p>
+        </w:tc>
+        <w:tc>
+          <w:tcPr>
+            <w:tcW w:w="4544" w:type="dxa"/>
+            <w:tcMar>
+              <w:top w:w="30" w:type="dxa"/>
+              <w:left w:w="60" w:type="dxa"/>
+              <w:bottom w:w="30" w:type="dxa"/>
+              <w:right w:w="60" w:type="dxa"/>
+            </w:tcMar>
+            <w:vAlign w:val="center"/>
+          </w:tcPr>
+          <w:p>
+            <w:pPr>
+              <w:spacing w:before="20" w:after="20" w:line="220" w:lineRule="auto"/>
+              <w:rPr>
+                <w:rFonts w:ascii="Consolas" w:hAnsi="Consolas" w:cs="Consolas"/>
+                <w:color w:val="7C3AED"/>
+                <w:sz w:val="16"/>
+              </w:rPr>
+            </w:pPr>
+            <w:r>
+              <w:rPr>
+                <w:rFonts w:ascii="Consolas" w:hAnsi="Consolas" w:cs="Consolas"/>
+                <w:color w:val="7C3AED"/>
+                <w:sz w:val="16"/>
+              </w:rPr>
+              <w:t>{"memberName": "alice", "eventName": "X", "optionIndex": 0, "quantity": 5}</w:t>
+            </w:r>
+          </w:p>
+        </w:tc>
+        <w:tc>
+          <w:tcPr>
+            <w:tcW w:w="2041" w:type="dxa"/>
+            <w:tcMar>
+              <w:top w:w="30" w:type="dxa"/>
+              <w:left w:w="60" w:type="dxa"/>
+              <w:bottom w:w="30" w:type="dxa"/>
+              <w:right w:w="60" w:type="dxa"/>
+            </w:tcMar>
+            <w:vAlign w:val="center"/>
+          </w:tcPr>
+          <w:p>
+            <w:pPr>
+              <w:spacing w:before="20" w:after="20" w:line="220" w:lineRule="auto"/>
+              <w:rPr>
+                <w:sz w:val="16"/>
+              </w:rPr>
+            </w:pPr>
+            <w:r>
+              <w:rPr>
+                <w:sz w:val="16"/>
+              </w:rPr>
+              <w:t>Buy shares (LMSR events).</w:t>
+            </w:r>
+          </w:p>
+        </w:tc>
+      </w:tr>
+      <w:tr>
+        <w:trPr>
+          <w:trHeight w:val="726"/>
+        </w:trPr>
+        <w:tc>
+          <w:tcPr>
+            <w:tcW w:w="968" w:type="dxa"/>
+            <w:tcMar>
+              <w:top w:w="30" w:type="dxa"/>
+              <w:left w:w="60" w:type="dxa"/>
+              <w:bottom w:w="30" w:type="dxa"/>
+              <w:right w:w="60" w:type="dxa"/>
+            </w:tcMar>
+            <w:vAlign w:val="center"/>
+          </w:tcPr>
+          <w:p>
+            <w:pPr>
+              <w:spacing w:before="20" w:after="20" w:line="220" w:lineRule="auto"/>
+              <w:jc w:val="center"/>
+              <w:rPr>
+                <w:rFonts w:ascii="Consolas" w:hAnsi="Consolas" w:cs="Consolas"/>
+                <w:b/>
+                <w:sz w:val="16"/>
+              </w:rPr>
+            </w:pPr>
+            <w:r>
+              <w:rPr>
+                <w:rFonts w:ascii="Consolas" w:hAnsi="Consolas" w:cs="Consolas"/>
+                <w:b/>
+                <w:sz w:val="16"/>
+              </w:rPr>
+              <w:t>POST</w:t>
+            </w:r>
+          </w:p>
+        </w:tc>
+        <w:tc>
+          <w:tcPr>
+            <w:tcW w:w="2851" w:type="dxa"/>
+            <w:tcMar>
+              <w:top w:w="30" w:type="dxa"/>
+              <w:left w:w="60" w:type="dxa"/>
+              <w:bottom w:w="30" w:type="dxa"/>
+              <w:right w:w="60" w:type="dxa"/>
+            </w:tcMar>
+            <w:vAlign w:val="center"/>
+          </w:tcPr>
+          <w:p>
+            <w:pPr>
+              <w:spacing w:before="20" w:after="20" w:line="220" w:lineRule="auto"/>
+              <w:rPr>
+                <w:rFonts w:ascii="Consolas" w:hAnsi="Consolas" w:cs="Consolas"/>
+                <w:sz w:val="16"/>
+              </w:rPr>
+            </w:pPr>
+            <w:r>
+              <w:rPr>
+                <w:rFonts w:ascii="Consolas" w:hAnsi="Consolas" w:cs="Consolas"/>
+                <w:sz w:val="16"/>
+              </w:rPr>
+              <w:t>/events/order</w:t>
+            </w:r>
+          </w:p>
+        </w:tc>
+        <w:tc>
+          <w:tcPr>
+            <w:tcW w:w="4544" w:type="dxa"/>
+            <w:tcMar>
+              <w:top w:w="30" w:type="dxa"/>
+              <w:left w:w="60" w:type="dxa"/>
+              <w:bottom w:w="30" w:type="dxa"/>
+              <w:right w:w="60" w:type="dxa"/>
+            </w:tcMar>
+            <w:vAlign w:val="center"/>
+          </w:tcPr>
+          <w:p>
+            <w:pPr>
+              <w:spacing w:before="20" w:after="20" w:line="220" w:lineRule="auto"/>
+              <w:rPr>
+                <w:rFonts w:ascii="Consolas" w:hAnsi="Consolas" w:cs="Consolas"/>
+                <w:color w:val="7C3AED"/>
+                <w:sz w:val="16"/>
+              </w:rPr>
+            </w:pPr>
+            <w:r>
+              <w:rPr>
+                <w:rFonts w:ascii="Consolas" w:hAnsi="Consolas" w:cs="Consolas"/>
+                <w:color w:val="7C3AED"/>
+                <w:sz w:val="16"/>
+              </w:rPr>
+              <w:t>{"userName": "alice", "eventName": "X", "optionIndex": 0, "side": "BUY", "price": 0.45, "quantity": 4}</w:t>
+            </w:r>
+          </w:p>
+        </w:tc>
+        <w:tc>
+          <w:tcPr>
+            <w:tcW w:w="2041" w:type="dxa"/>
+            <w:tcMar>
+              <w:top w:w="30" w:type="dxa"/>
+              <w:left w:w="60" w:type="dxa"/>
+              <w:bottom w:w="30" w:type="dxa"/>
+              <w:right w:w="60" w:type="dxa"/>
+            </w:tcMar>
+            <w:vAlign w:val="center"/>
+          </w:tcPr>
+          <w:p>
+            <w:pPr>
+              <w:spacing w:before="20" w:after="20" w:line="220" w:lineRule="auto"/>
+              <w:rPr>
+                <w:sz w:val="16"/>
+              </w:rPr>
+            </w:pPr>
+            <w:r>
+              <w:rPr>
+                <w:sz w:val="16"/>
+              </w:rPr>
+              <w:t>Bid/ask (Order Book events).</w:t>
+            </w:r>
+          </w:p>
+        </w:tc>
+      </w:tr>
+      <w:tr>
+        <w:trPr>
+          <w:trHeight w:val="939"/>
+        </w:trPr>
+        <w:tc>
+          <w:tcPr>
+            <w:tcW w:w="968" w:type="dxa"/>
+            <w:tcMar>
+              <w:top w:w="30" w:type="dxa"/>
+              <w:left w:w="60" w:type="dxa"/>
+              <w:bottom w:w="30" w:type="dxa"/>
+              <w:right w:w="60" w:type="dxa"/>
+            </w:tcMar>
+            <w:vAlign w:val="center"/>
+          </w:tcPr>
+          <w:p>
+            <w:pPr>
+              <w:spacing w:before="20" w:after="20" w:line="220" w:lineRule="auto"/>
+              <w:jc w:val="center"/>
+              <w:rPr>
+                <w:rFonts w:ascii="Consolas" w:hAnsi="Consolas" w:cs="Consolas"/>
+                <w:b/>
+                <w:sz w:val="16"/>
+              </w:rPr>
+            </w:pPr>
+            <w:r>
+              <w:rPr>
+                <w:rFonts w:ascii="Consolas" w:hAnsi="Consolas" w:cs="Consolas"/>
+                <w:b/>
+                <w:sz w:val="16"/>
+              </w:rPr>
+              <w:t>POST</w:t>
+            </w:r>
+          </w:p>
+        </w:tc>
+        <w:tc>
+          <w:tcPr>
+            <w:tcW w:w="2851" w:type="dxa"/>
+            <w:tcMar>
+              <w:top w:w="30" w:type="dxa"/>
+              <w:left w:w="60" w:type="dxa"/>
+              <w:bottom w:w="30" w:type="dxa"/>
+              <w:right w:w="60" w:type="dxa"/>
+            </w:tcMar>
+            <w:vAlign w:val="center"/>
+          </w:tcPr>
+          <w:p>
+            <w:pPr>
+              <w:spacing w:before="20" w:after="20" w:line="220" w:lineRule="auto"/>
+              <w:rPr>
+                <w:rFonts w:ascii="Consolas" w:hAnsi="Consolas" w:cs="Consolas"/>
+                <w:sz w:val="16"/>
+              </w:rPr>
+            </w:pPr>
+            <w:r>
+              <w:rPr>
+                <w:rFonts w:ascii="Consolas" w:hAnsi="Consolas" w:cs="Consolas"/>
+                <w:sz w:val="16"/>
+              </w:rPr>
+              <w:t>/events/create-lmsr</w:t>
+            </w:r>
+          </w:p>
+        </w:tc>
+        <w:tc>
+          <w:tcPr>
+            <w:tcW w:w="4544" w:type="dxa"/>
+            <w:tcMar>
+              <w:top w:w="30" w:type="dxa"/>
+              <w:left w:w="60" w:type="dxa"/>
+              <w:bottom w:w="30" w:type="dxa"/>
+              <w:right w:w="60" w:type="dxa"/>
+            </w:tcMar>
+            <w:vAlign w:val="center"/>
+          </w:tcPr>
+          <w:p>
+            <w:pPr>
+              <w:spacing w:before="20" w:after="20" w:line="220" w:lineRule="auto"/>
+              <w:rPr>
+                <w:rFonts w:ascii="Consolas" w:hAnsi="Consolas" w:cs="Consolas"/>
+                <w:color w:val="7C3AED"/>
+                <w:sz w:val="16"/>
+              </w:rPr>
+            </w:pPr>
+            <w:r>
+              <w:rPr>
+                <w:rFonts w:ascii="Consolas" w:hAnsi="Consolas" w:cs="Consolas"/>
+                <w:color w:val="7C3AED"/>
+                <w:sz w:val="16"/>
+              </w:rPr>
+              <w:t>{"creatorName": "alice", "name": "X", "description": "...", "commission": 5, "commissionType": "ON_PURCHASE", "optionNames": ["Yes", "No"], "b": 100}</w:t>
+            </w:r>
+          </w:p>
+        </w:tc>
+        <w:tc>
+          <w:tcPr>
+            <w:tcW w:w="2041" w:type="dxa"/>
+            <w:tcMar>
+              <w:top w:w="30" w:type="dxa"/>
+              <w:left w:w="60" w:type="dxa"/>
+              <w:bottom w:w="30" w:type="dxa"/>
+              <w:right w:w="60" w:type="dxa"/>
+            </w:tcMar>
+            <w:vAlign w:val="center"/>
+          </w:tcPr>
+          <w:p>
+            <w:pPr>
+              <w:spacing w:before="20" w:after="20" w:line="220" w:lineRule="auto"/>
+              <w:rPr>
+                <w:sz w:val="16"/>
+              </w:rPr>
+            </w:pPr>
+            <w:r>
+              <w:rPr>
+                <w:sz w:val="16"/>
+              </w:rPr>
+              <w:t>Create one LMSR event directly.</w:t>
+            </w:r>
+          </w:p>
+        </w:tc>
+      </w:tr>
+      <w:tr>
+        <w:trPr>
+          <w:trHeight w:val="1167"/>
+        </w:trPr>
+        <w:tc>
+          <w:tcPr>
+            <w:tcW w:w="968" w:type="dxa"/>
+            <w:tcMar>
+              <w:top w:w="30" w:type="dxa"/>
+              <w:left w:w="60" w:type="dxa"/>
+              <w:bottom w:w="30" w:type="dxa"/>
+              <w:right w:w="60" w:type="dxa"/>
+            </w:tcMar>
+            <w:vAlign w:val="center"/>
+          </w:tcPr>
+          <w:p>
+            <w:pPr>
+              <w:spacing w:before="20" w:after="20" w:line="220" w:lineRule="auto"/>
+              <w:jc w:val="center"/>
+              <w:rPr>
+                <w:rFonts w:ascii="Consolas" w:hAnsi="Consolas" w:cs="Consolas"/>
+                <w:b/>
+                <w:sz w:val="16"/>
+              </w:rPr>
+            </w:pPr>
+            <w:r>
+              <w:rPr>
+                <w:rFonts w:ascii="Consolas" w:hAnsi="Consolas" w:cs="Consolas"/>
+                <w:b/>
+                <w:sz w:val="16"/>
+              </w:rPr>
+              <w:t>POST</w:t>
+            </w:r>
+          </w:p>
+        </w:tc>
+        <w:tc>
+          <w:tcPr>
+            <w:tcW w:w="2851" w:type="dxa"/>
+            <w:tcMar>
+              <w:top w:w="30" w:type="dxa"/>
+              <w:left w:w="60" w:type="dxa"/>
+              <w:bottom w:w="30" w:type="dxa"/>
+              <w:right w:w="60" w:type="dxa"/>
+            </w:tcMar>
+            <w:vAlign w:val="center"/>
+          </w:tcPr>
+          <w:p>
+            <w:pPr>
+              <w:spacing w:before="20" w:after="20" w:line="220" w:lineRule="auto"/>
+              <w:rPr>
+                <w:rFonts w:ascii="Consolas" w:hAnsi="Consolas" w:cs="Consolas"/>
+                <w:sz w:val="16"/>
+              </w:rPr>
+            </w:pPr>
+            <w:r>
+              <w:rPr>
+                <w:rFonts w:ascii="Consolas" w:hAnsi="Consolas" w:cs="Consolas"/>
+                <w:sz w:val="16"/>
+              </w:rPr>
+              <w:t>/events/create-orderbook</w:t>
+            </w:r>
+          </w:p>
+        </w:tc>
+        <w:tc>
+          <w:tcPr>
+            <w:tcW w:w="4544" w:type="dxa"/>
+            <w:tcMar>
+              <w:top w:w="30" w:type="dxa"/>
+              <w:left w:w="60" w:type="dxa"/>
+              <w:bottom w:w="30" w:type="dxa"/>
+              <w:right w:w="60" w:type="dxa"/>
+            </w:tcMar>
+            <w:vAlign w:val="center"/>
+          </w:tcPr>
+          <w:p>
+            <w:pPr>
+              <w:spacing w:before="20" w:after="20" w:line="220" w:lineRule="auto"/>
+              <w:rPr>
+                <w:rFonts w:ascii="Consolas" w:hAnsi="Consolas" w:cs="Consolas"/>
+                <w:color w:val="7C3AED"/>
+                <w:sz w:val="16"/>
+              </w:rPr>
+            </w:pPr>
+            <w:r>
+              <w:rPr>
+                <w:rFonts w:ascii="Consolas" w:hAnsi="Consolas" w:cs="Consolas"/>
+                <w:color w:val="7C3AED"/>
+                <w:sz w:val="16"/>
+              </w:rPr>
+              <w:t>{"creatorName": "alice", "name": "X", "description": "...", "commission": 5, "commissionType": "ON_PURCHASE", "optionNames": ["Yes", "No"], "allowMint": true, "initial": 50, "d": 1}</w:t>
+            </w:r>
+          </w:p>
+        </w:tc>
+        <w:tc>
+          <w:tcPr>
+            <w:tcW w:w="2041" w:type="dxa"/>
+            <w:tcMar>
+              <w:top w:w="30" w:type="dxa"/>
+              <w:left w:w="60" w:type="dxa"/>
+              <w:bottom w:w="30" w:type="dxa"/>
+              <w:right w:w="60" w:type="dxa"/>
+            </w:tcMar>
+            <w:vAlign w:val="center"/>
+          </w:tcPr>
+          <w:p>
+            <w:pPr>
+              <w:spacing w:before="20" w:after="20" w:line="220" w:lineRule="auto"/>
+              <w:rPr>
+                <w:sz w:val="16"/>
+              </w:rPr>
+            </w:pPr>
+            <w:r>
+              <w:rPr>
+                <w:sz w:val="16"/>
+              </w:rPr>
+              <w:t>Create one Order Book event directly.</w:t>
+            </w:r>
+          </w:p>
+        </w:tc>
+      </w:tr>
+      <w:tr>
+        <w:trPr>
+          <w:trHeight w:val="284"/>
+        </w:trPr>
+        <w:tc>
+          <w:tcPr>
+            <w:tcW w:w="968" w:type="dxa"/>
+            <w:tcMar>
+              <w:top w:w="30" w:type="dxa"/>
+              <w:left w:w="60" w:type="dxa"/>
+              <w:bottom w:w="30" w:type="dxa"/>
+              <w:right w:w="60" w:type="dxa"/>
+            </w:tcMar>
+            <w:vAlign w:val="center"/>
+          </w:tcPr>
+          <w:p>
+            <w:pPr>
+              <w:spacing w:before="20" w:after="20" w:line="220" w:lineRule="auto"/>
+              <w:jc w:val="center"/>
+              <w:rPr>
+                <w:rFonts w:ascii="Consolas" w:hAnsi="Consolas" w:cs="Consolas"/>
+                <w:b/>
+                <w:sz w:val="16"/>
+              </w:rPr>
+            </w:pPr>
+            <w:r>
+              <w:rPr>
+                <w:rFonts w:ascii="Consolas" w:hAnsi="Consolas" w:cs="Consolas"/>
+                <w:b/>
+                <w:sz w:val="16"/>
+              </w:rPr>
+              <w:t>POST</w:t>
+            </w:r>
+          </w:p>
+        </w:tc>
+        <w:tc>
+          <w:tcPr>
+            <w:tcW w:w="2851" w:type="dxa"/>
+            <w:tcMar>
+              <w:top w:w="30" w:type="dxa"/>
+              <w:left w:w="60" w:type="dxa"/>
+              <w:bottom w:w="30" w:type="dxa"/>
+              <w:right w:w="60" w:type="dxa"/>
+            </w:tcMar>
+            <w:vAlign w:val="center"/>
+          </w:tcPr>
+          <w:p>
+            <w:pPr>
+              <w:spacing w:before="20" w:after="20" w:line="220" w:lineRule="auto"/>
+              <w:rPr>
+                <w:rFonts w:ascii="Consolas" w:hAnsi="Consolas" w:cs="Consolas"/>
+                <w:sz w:val="16"/>
+              </w:rPr>
+            </w:pPr>
+            <w:r>
+              <w:rPr>
+                <w:rFonts w:ascii="Consolas" w:hAnsi="Consolas" w:cs="Consolas"/>
+                <w:sz w:val="16"/>
+              </w:rPr>
+              <w:t>/chat</w:t>
+            </w:r>
+          </w:p>
+        </w:tc>
+        <w:tc>
+          <w:tcPr>
+            <w:tcW w:w="4544" w:type="dxa"/>
+            <w:tcMar>
+              <w:top w:w="30" w:type="dxa"/>
+              <w:left w:w="60" w:type="dxa"/>
+              <w:bottom w:w="30" w:type="dxa"/>
+              <w:right w:w="60" w:type="dxa"/>
+            </w:tcMar>
+            <w:vAlign w:val="center"/>
+          </w:tcPr>
+          <w:p>
+            <w:pPr>
+              <w:spacing w:before="20" w:after="20" w:line="220" w:lineRule="auto"/>
+              <w:rPr>
+                <w:rFonts w:ascii="Consolas" w:hAnsi="Consolas" w:cs="Consolas"/>
+                <w:color w:val="7C3AED"/>
+                <w:sz w:val="16"/>
+              </w:rPr>
+            </w:pPr>
+            <w:r>
+              <w:rPr>
+                <w:rFonts w:ascii="Consolas" w:hAnsi="Consolas" w:cs="Consolas"/>
+                <w:color w:val="7C3AED"/>
+                <w:sz w:val="16"/>
+              </w:rPr>
+              <w:t>{"userName": "alice", "message": "hi"}</w:t>
+            </w:r>
+          </w:p>
+        </w:tc>
+        <w:tc>
+          <w:tcPr>
+            <w:tcW w:w="2041" w:type="dxa"/>
+            <w:tcMar>
+              <w:top w:w="30" w:type="dxa"/>
+              <w:left w:w="60" w:type="dxa"/>
+              <w:bottom w:w="30" w:type="dxa"/>
+              <w:right w:w="60" w:type="dxa"/>
+            </w:tcMar>
+            <w:vAlign w:val="center"/>
+          </w:tcPr>
+          <w:p>
+            <w:pPr>
+              <w:spacing w:before="20" w:after="20" w:line="220" w:lineRule="auto"/>
+              <w:rPr>
+                <w:sz w:val="16"/>
+              </w:rPr>
+            </w:pPr>
+            <w:r>
+              <w:rPr>
+                <w:sz w:val="16"/>
+              </w:rPr>
+              <w:t>Post a chat message.</w:t>
+            </w:r>
+          </w:p>
+        </w:tc>
+      </w:tr>
+      <w:tr>
+        <w:trPr>
+          <w:trHeight w:val="284"/>
+        </w:trPr>
+        <w:tc>
+          <w:tcPr>
+            <w:tcW w:w="968" w:type="dxa"/>
+            <w:tcMar>
+              <w:top w:w="30" w:type="dxa"/>
+              <w:left w:w="60" w:type="dxa"/>
+              <w:bottom w:w="30" w:type="dxa"/>
+              <w:right w:w="60" w:type="dxa"/>
+            </w:tcMar>
+            <w:vAlign w:val="center"/>
+          </w:tcPr>
+          <w:p>
+            <w:pPr>
+              <w:spacing w:before="20" w:after="20" w:line="220" w:lineRule="auto"/>
+              <w:jc w:val="center"/>
+              <w:rPr>
+                <w:rFonts w:ascii="Consolas" w:hAnsi="Consolas" w:cs="Consolas"/>
+                <w:b/>
+                <w:sz w:val="16"/>
+              </w:rPr>
+            </w:pPr>
+            <w:r>
+              <w:rPr>
+                <w:rFonts w:ascii="Consolas" w:hAnsi="Consolas" w:cs="Consolas"/>
+                <w:b/>
+                <w:sz w:val="16"/>
+              </w:rPr>
+              <w:t>GET</w:t>
+            </w:r>
+          </w:p>
+        </w:tc>
+        <w:tc>
+          <w:tcPr>
+            <w:tcW w:w="2851" w:type="dxa"/>
+            <w:tcMar>
+              <w:top w:w="30" w:type="dxa"/>
+              <w:left w:w="60" w:type="dxa"/>
+              <w:bottom w:w="30" w:type="dxa"/>
+              <w:right w:w="60" w:type="dxa"/>
+            </w:tcMar>
+            <w:vAlign w:val="center"/>
+          </w:tcPr>
+          <w:p>
+            <w:pPr>
+              <w:spacing w:before="20" w:after="20" w:line="220" w:lineRule="auto"/>
+              <w:rPr>
+                <w:rFonts w:ascii="Consolas" w:hAnsi="Consolas" w:cs="Consolas"/>
+                <w:sz w:val="16"/>
+              </w:rPr>
+            </w:pPr>
+            <w:r>
+              <w:rPr>
+                <w:rFonts w:ascii="Consolas" w:hAnsi="Consolas" w:cs="Consolas"/>
+                <w:sz w:val="16"/>
+              </w:rPr>
+              <w:t>/chat</w:t>
+            </w:r>
+          </w:p>
+        </w:tc>
+        <w:tc>
+          <w:tcPr>
+            <w:tcW w:w="4544" w:type="dxa"/>
+            <w:tcMar>
+              <w:top w:w="30" w:type="dxa"/>
+              <w:left w:w="60" w:type="dxa"/>
+              <w:bottom w:w="30" w:type="dxa"/>
+              <w:right w:w="60" w:type="dxa"/>
+            </w:tcMar>
+            <w:vAlign w:val="center"/>
+          </w:tcPr>
+          <w:p>
+            <w:pPr>
+              <w:spacing w:before="20" w:after="20" w:line="220" w:lineRule="auto"/>
+              <w:rPr>
+                <w:rFonts w:ascii="Consolas" w:hAnsi="Consolas" w:cs="Consolas"/>
+                <w:color w:val="7C3AED"/>
+                <w:sz w:val="16"/>
+              </w:rPr>
+            </w:pPr>
+            <w:r>
+              <w:rPr>
+                <w:rFonts w:ascii="Consolas" w:hAnsi="Consolas" w:cs="Consolas"/>
+                <w:color w:val="7C3AED"/>
+                <w:sz w:val="16"/>
+              </w:rPr>
+              <w:t>-</w:t>
+            </w:r>
+          </w:p>
+        </w:tc>
+        <w:tc>
+          <w:tcPr>
+            <w:tcW w:w="2041" w:type="dxa"/>
+            <w:tcMar>
+              <w:top w:w="30" w:type="dxa"/>
+              <w:left w:w="60" w:type="dxa"/>
+              <w:bottom w:w="30" w:type="dxa"/>
+              <w:right w:w="60" w:type="dxa"/>
+            </w:tcMar>
+            <w:vAlign w:val="center"/>
+          </w:tcPr>
+          <w:p>
+            <w:pPr>
+              <w:spacing w:before="20" w:after="20" w:line="220" w:lineRule="auto"/>
+              <w:rPr>
+                <w:sz w:val="16"/>
+              </w:rPr>
+            </w:pPr>
+            <w:r>
+              <w:rPr>
+                <w:sz w:val="16"/>
+              </w:rPr>
+              <w:t>List chat messages.</w:t>
+            </w:r>
+          </w:p>
+        </w:tc>
+      </w:tr>
+    </w:tbl>
+    <w:p>
+      <w:pPr>
+        <w:spacing w:after="120"/>
+      </w:pPr>
+      <w:r>
+        <w:t xml:space="preserve">Every endpoint below is served from the same base URL, </w:t>
+      </w:r>
+      <w:r>
+        <w:rPr>
+          <w:rStyle w:val="VerbatimChar"/>
+        </w:rPr>
+        <w:t>http://localhost:8080/guessmarket</w:t>
+      </w:r>
+      <w:r>
+        <w:t xml:space="preserve">, and </w:t>
+      </w:r>
+      <w:r>
+        <w:t>everyone</w:t>
+      </w:r>
+      <w:r>
+        <w:t xml:space="preserve"> was re-confirmed directly against the running server while writing this table.</w:t>
+      </w:r>
+    </w:p>
+    <w:p>
+      <w:pPr>
+        <w:spacing w:before="160"/>
+      </w:pPr>
+      <w:r>
+        <w:rPr>
+          <w:i/>
+          <w:sz w:val="19"/>
+        </w:rPr>
+        <w:t xml:space="preserve">Every response is JSON. A failed request returns </w:t>
+      </w:r>
+      <w:r>
+        <w:rPr>
+          <w:rStyle w:val="VerbatimChar"/>
+          <w:sz w:val="17"/>
+        </w:rPr>
+        <w:t>{"error": "..."}</w:t>
+      </w:r>
+      <w:r>
+        <w:rPr>
+          <w:i/>
+          <w:sz w:val="19"/>
+        </w:rPr>
+        <w:t xml:space="preserve"> with HTTP 400 for a validation error or HTTP 500 for an unexpected one. </w:t>
+      </w:r>
+      <w:r>
+        <w:rPr>
+          <w:rStyle w:val="VerbatimChar"/>
+          <w:sz w:val="17"/>
+        </w:rPr>
+        <w:t>commissionType</w:t>
+      </w:r>
+      <w:r>
+        <w:rPr>
+          <w:i/>
+          <w:sz w:val="19"/>
+        </w:rPr>
+        <w:t xml:space="preserve"> is </w:t>
+      </w:r>
+      <w:r>
+        <w:rPr>
+          <w:rStyle w:val="VerbatimChar"/>
+          <w:sz w:val="17"/>
+        </w:rPr>
+        <w:t>ON_PURCHASE</w:t>
+      </w:r>
+      <w:r>
+        <w:rPr>
+          <w:i/>
+          <w:sz w:val="19"/>
+        </w:rPr>
+        <w:t xml:space="preserve"> or </w:t>
+      </w:r>
+      <w:r>
+        <w:rPr>
+          <w:rStyle w:val="VerbatimChar"/>
+          <w:sz w:val="17"/>
+        </w:rPr>
+        <w:t>ON_CLOSE</w:t>
+      </w:r>
+      <w:r>
+        <w:rPr>
+          <w:i/>
+          <w:sz w:val="19"/>
+        </w:rPr>
+        <w:t xml:space="preserve">; </w:t>
+      </w:r>
+      <w:r>
+        <w:rPr>
+          <w:rStyle w:val="VerbatimChar"/>
+          <w:sz w:val="17"/>
+        </w:rPr>
+        <w:t>side</w:t>
+      </w:r>
+      <w:r>
+        <w:rPr>
+          <w:i/>
+          <w:sz w:val="19"/>
+        </w:rPr>
+        <w:t xml:space="preserve"> is </w:t>
+      </w:r>
+      <w:r>
+        <w:rPr>
+          <w:rStyle w:val="VerbatimChar"/>
+          <w:sz w:val="17"/>
+        </w:rPr>
+        <w:t>BUY</w:t>
+      </w:r>
+      <w:r>
+        <w:rPr>
+          <w:i/>
+          <w:sz w:val="19"/>
+        </w:rPr>
+        <w:t xml:space="preserve"> or </w:t>
+      </w:r>
+      <w:r>
+        <w:rPr>
+          <w:rStyle w:val="VerbatimChar"/>
+          <w:sz w:val="17"/>
+        </w:rPr>
+        <w:t>SELL</w:t>
+      </w:r>
+      <w:r>
+        <w:rPr>
+          <w:i/>
+          <w:sz w:val="19"/>
+        </w:rPr>
+        <w:t>.</w:t>
+      </w:r>
+    </w:p>
+    <w:p>
+      <w:r>
+        <w:br w:type="page"/>
+      </w:r>
+    </w:p>
+    <w:p>
+      <w:pPr>
+        <w:pStyle w:val="1"/>
       </w:pPr>
       <w:bookmarkStart w:id="8" w:name="design-choices-and-assumptions"/>
       <w:bookmarkEnd w:id="6"/>
@@ -712,8 +2774,23 @@
       <w:pPr>
         <w:pStyle w:val="2"/>
       </w:pPr>
+      <w:bookmarkEnd w:id="13"/>
+      <w:bookmarkStart w:id="100" w:name="other-users-info-required-minimum-always-visible"/>
+      <w:r>
+        <w:t>Other users' info: the required minimum is always visible, the rest is read-only</w:t>
+      </w:r>
+    </w:p>
+    <w:p>
+      <w:r>
+        <w:t>The specification draws a hard line here: a user's own account screen is private, but for every other user in the system it must additionally show their username, their account balance, and whether they are a Market Maker – nothing says it has to stop there, and nothing says how it has to be revealed. The left-hand user list satisfies that literally, for every row, with no click required: a name, a balance pill, and a MARKET MAKER pill when it applies. Selecting a user goes further and opens the same detailed view Exercise 2 used for your own account – which events they hold shares in, and how many – reusing exactly the components the specification asks projects to reuse, but with every Buy/Sell/Deposit/Open/Close control disabled, since a user may still only ever act on their own behalf. The extra detail is read-only visibility layered on top of the required minimum, never additional capability.</w:t>
+      </w:r>
+    </w:p>
+    <w:p>
+      <w:pPr>
+        <w:pStyle w:val="2"/>
+      </w:pPr>
       <w:bookmarkStart w:id="14" w:name="X5c62b9f5e3a96dec03de988ed38f2bd32c9993e"/>
-      <w:bookmarkEnd w:id="13"/>
+      <w:bookmarkEnd w:id="100"/>
       <w:r>
         <w:t>Chat colors are assigned per-client, not stored on the server</w:t>
       </w:r>

</xml_diff>

<commit_message>
ex3 done - submission level ready
</commit_message>
<xml_diff>
--- a/submission ex3/readme.docx
+++ b/submission ex3/readme.docx
@@ -2789,8 +2789,23 @@
       <w:pPr>
         <w:pStyle w:val="2"/>
       </w:pPr>
+      <w:bookmarkEnd w:id="100"/>
+      <w:bookmarkStart w:id="101" w:name="spinner-input-clamped-not-rejected"/>
+      <w:r>
+        <w:t>Out-of-range Spinner input is clamped, not rejected</w:t>
+      </w:r>
+    </w:p>
+    <w:p>
+      <w:r>
+        <w:t>Every bounded numeric field in the app – commission %, LMSR's b, Order Book's initial and d, quantities, price, deposit amount – is a plain JavaFX Spinner with a min/max range. Its arrows can never leave that range, but typing a value directly and confirming it (a negative commission, for instance) isn't rejected outright: JavaFX's own Spinner clamps it to the nearest legal bound instead – 0, in that example – the same built-in behavior the platform control already has everywhere it's used in this app. This wasn't worth overriding with extra validation on top of it, since resolving an out-of-range number to the closest legal one is itself a reasonable, unsurprising outcome.</w:t>
+      </w:r>
+    </w:p>
+    <w:p>
+      <w:pPr>
+        <w:pStyle w:val="2"/>
+      </w:pPr>
       <w:bookmarkStart w:id="14" w:name="X5c62b9f5e3a96dec03de988ed38f2bd32c9993e"/>
-      <w:bookmarkEnd w:id="100"/>
+      <w:bookmarkEnd w:id="101"/>
       <w:r>
         <w:t>Chat colors are assigned per-client, not stored on the server</w:t>
       </w:r>

</xml_diff>

<commit_message>
Ex3: event names are case-insensitive across uploads and Create Event; both submissions repackaged
</commit_message>
<xml_diff>
--- a/submission ex3/readme.docx
+++ b/submission ex3/readme.docx
@@ -2717,12 +2717,12 @@
       <w:bookmarkStart w:id="10" w:name="Xd90b2e1cccfb3974e8beb7c831fd62fd7830390"/>
       <w:bookmarkEnd w:id="9"/>
       <w:r>
-        <w:t>Event names are compared exactly; usernames are compared case-insensitively</w:t>
-      </w:r>
-    </w:p>
-    <w:p>
-      <w:r>
-        <w:t>A username is a login key in both directions, so “Bob” and “bob” are treated as the same person; an event’s name is simply a title its Market Maker chose, and I saw nothing in the specification asking for its case to be folded too.</w:t>
+        <w:t>Event names and usernames are both compared case-insensitively</w:t>
+      </w:r>
+    </w:p>
+    <w:p>
+      <w:r>
+        <w:t>The Exercise 3 schema dropped the event id, so an event is now identified by its name alone. Following the specification’s general rule that all English input is case-insensitive (“MoMo” = “mOmO”) - the same rule Exercise 2 already applied to usernames and option names - two event names that differ only in letter case count as the same event: while an event named “Rain” exists, uploading or creating “rain” is rejected, whether within one file or across separate uploads, and the error names the existing event. Usernames follow the same rule, so “Bob” and “bob” are the same person.</w:t>
       </w:r>
     </w:p>
     <w:p>

</xml_diff>